<commit_message>
Grid shows (this computer) Grid shows Num EE > 1 per sample
git-svn-id: https://sources.ecopath.org/svn/Ecopath/trunk/Ecopath6@14396 a725721c-0ed6-864e-a6a8-02c2a1988c9d
</commit_message>
<xml_diff>
--- a/Sources Internal/Plugins/EwESampleRecorder/Documentation/EcoSampler.docx
+++ b/Sources Internal/Plugins/EwESampleRecorder/Documentation/EcoSampler.docx
@@ -262,16 +262,14 @@
                               <w:rPr>
                                 <w:color w:val="auto"/>
                               </w:rPr>
-                              <w:t xml:space="preserve"> interface</w:t>
+                              <w:t xml:space="preserve"> interface:</w:t>
                             </w:r>
-                            <w:proofErr w:type="gramStart"/>
                             <w:r>
                               <w:rPr>
                                 <w:color w:val="auto"/>
                               </w:rPr>
-                              <w:t>:</w:t>
+                              <w:t xml:space="preserve"> </w:t>
                             </w:r>
-                            <w:proofErr w:type="gramEnd"/>
                             <w:r>
                               <w:rPr>
                                 <w:color w:val="auto"/>
@@ -282,7 +280,15 @@
                               <w:rPr>
                                 <w:color w:val="auto"/>
                               </w:rPr>
-                              <w:t>1) toolbar, 2) Samples list, 3) Sample management, 4) Run panel</w:t>
+                              <w:t>1) toolbar, 2) Samples list, 3) Sa</w:t>
+                            </w:r>
+                            <w:bookmarkStart w:id="3" w:name="_GoBack"/>
+                            <w:bookmarkEnd w:id="3"/>
+                            <w:r>
+                              <w:rPr>
+                                <w:color w:val="auto"/>
+                              </w:rPr>
+                              <w:t>mple management, 4) Run panel</w:t>
                             </w:r>
                           </w:p>
                         </w:txbxContent>
@@ -319,7 +325,7 @@
                           <w:color w:val="auto"/>
                         </w:rPr>
                       </w:pPr>
-                      <w:bookmarkStart w:id="3" w:name="_Ref463352122"/>
+                      <w:bookmarkStart w:id="4" w:name="_Ref463352122"/>
                       <w:r>
                         <w:rPr>
                           <w:color w:val="auto"/>
@@ -357,7 +363,7 @@
                         </w:rPr>
                         <w:fldChar w:fldCharType="end"/>
                       </w:r>
-                      <w:bookmarkEnd w:id="3"/>
+                      <w:bookmarkEnd w:id="4"/>
                       <w:r>
                         <w:rPr>
                           <w:color w:val="auto"/>
@@ -376,16 +382,14 @@
                         <w:rPr>
                           <w:color w:val="auto"/>
                         </w:rPr>
-                        <w:t xml:space="preserve"> interface</w:t>
+                        <w:t xml:space="preserve"> interface:</w:t>
                       </w:r>
-                      <w:proofErr w:type="gramStart"/>
                       <w:r>
                         <w:rPr>
                           <w:color w:val="auto"/>
                         </w:rPr>
-                        <w:t>:</w:t>
+                        <w:t xml:space="preserve"> </w:t>
                       </w:r>
-                      <w:proofErr w:type="gramEnd"/>
                       <w:r>
                         <w:rPr>
                           <w:color w:val="auto"/>
@@ -396,7 +400,15 @@
                         <w:rPr>
                           <w:color w:val="auto"/>
                         </w:rPr>
-                        <w:t>1) toolbar, 2) Samples list, 3) Sample management, 4) Run panel</w:t>
+                        <w:t>1) toolbar, 2) Samples list, 3) Sa</w:t>
+                      </w:r>
+                      <w:bookmarkStart w:id="5" w:name="_GoBack"/>
+                      <w:bookmarkEnd w:id="5"/>
+                      <w:r>
+                        <w:rPr>
+                          <w:color w:val="auto"/>
+                        </w:rPr>
+                        <w:t>mple management, 4) Run panel</w:t>
                       </w:r>
                     </w:p>
                   </w:txbxContent>
@@ -938,8 +950,8 @@
         <w:pStyle w:val="Heading2"/>
         <w:contextualSpacing w:val="0"/>
       </w:pPr>
-      <w:bookmarkStart w:id="4" w:name="h.vlq3lgknrsfn" w:colFirst="0" w:colLast="0"/>
-      <w:bookmarkEnd w:id="4"/>
+      <w:bookmarkStart w:id="6" w:name="h.vlq3lgknrsfn" w:colFirst="0" w:colLast="0"/>
+      <w:bookmarkEnd w:id="6"/>
       <w:r>
         <w:t>Recording samples</w:t>
       </w:r>
@@ -1000,8 +1012,8 @@
       <w:pPr>
         <w:framePr w:w="3498" w:h="7683" w:hSpace="181" w:wrap="around" w:vAnchor="text" w:hAnchor="page" w:x="6960" w:y="-59"/>
       </w:pPr>
-      <w:bookmarkStart w:id="5" w:name="h.z4v56aogrrkc" w:colFirst="0" w:colLast="0"/>
-      <w:bookmarkEnd w:id="5"/>
+      <w:bookmarkStart w:id="7" w:name="h.z4v56aogrrkc" w:colFirst="0" w:colLast="0"/>
+      <w:bookmarkEnd w:id="7"/>
       <w:r>
         <w:rPr>
           <w:noProof/>
@@ -1092,7 +1104,7 @@
                                   <w:color w:val="auto"/>
                                 </w:rPr>
                               </w:pPr>
-                              <w:bookmarkStart w:id="6" w:name="_Ref463294383"/>
+                              <w:bookmarkStart w:id="8" w:name="_Ref463294383"/>
                               <w:r>
                                 <w:rPr>
                                   <w:color w:val="auto"/>
@@ -1131,7 +1143,7 @@
                                 </w:rPr>
                                 <w:fldChar w:fldCharType="end"/>
                               </w:r>
-                              <w:bookmarkEnd w:id="6"/>
+                              <w:bookmarkEnd w:id="8"/>
                               <w:r>
                                 <w:rPr>
                                   <w:color w:val="auto"/>
@@ -1163,25 +1175,6 @@
           <mc:Fallback>
             <w:pict>
               <v:group id="Group 11" o:spid="_x0000_s1033" style="position:absolute;margin-left:3pt;margin-top:6.7pt;width:172.5pt;height:378.85pt;z-index:251663360;mso-width-relative:margin;mso-height-relative:margin" coordsize="21907,48113" o:gfxdata="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">
-                <v:shapetype id="_x0000_t75" coordsize="21600,21600" o:spt="75" o:preferrelative="t" path="m@4@5l@4@11@9@11@9@5xe" filled="f" stroked="f">
-                  <v:stroke joinstyle="miter"/>
-                  <v:formulas>
-                    <v:f eqn="if lineDrawn pixelLineWidth 0"/>
-                    <v:f eqn="sum @0 1 0"/>
-                    <v:f eqn="sum 0 0 @1"/>
-                    <v:f eqn="prod @2 1 2"/>
-                    <v:f eqn="prod @3 21600 pixelWidth"/>
-                    <v:f eqn="prod @3 21600 pixelHeight"/>
-                    <v:f eqn="sum @0 0 1"/>
-                    <v:f eqn="prod @6 1 2"/>
-                    <v:f eqn="prod @7 21600 pixelWidth"/>
-                    <v:f eqn="sum @8 21600 0"/>
-                    <v:f eqn="prod @7 21600 pixelHeight"/>
-                    <v:f eqn="sum @10 21600 0"/>
-                  </v:formulas>
-                  <v:path o:extrusionok="f" gradientshapeok="t" o:connecttype="rect"/>
-                  <o:lock v:ext="edit" aspectratio="t"/>
-                </v:shapetype>
                 <v:shape id="image03.png" o:spid="_x0000_s1034" type="#_x0000_t75" alt="UI-layout-recorded.png" style="position:absolute;width:21907;height:44386;visibility:visible;mso-wrap-style:square" o:gfxdata="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">
                   <v:imagedata r:id="rId10" o:title="UI-layout-recorded"/>
                 </v:shape>
@@ -1195,7 +1188,7 @@
                             <w:color w:val="auto"/>
                           </w:rPr>
                         </w:pPr>
-                        <w:bookmarkStart w:id="7" w:name="_Ref463294383"/>
+                        <w:bookmarkStart w:id="9" w:name="_Ref463294383"/>
                         <w:r>
                           <w:rPr>
                             <w:color w:val="auto"/>
@@ -1234,7 +1227,7 @@
                           </w:rPr>
                           <w:fldChar w:fldCharType="end"/>
                         </w:r>
-                        <w:bookmarkEnd w:id="7"/>
+                        <w:bookmarkEnd w:id="9"/>
                         <w:r>
                           <w:rPr>
                             <w:color w:val="auto"/>
@@ -1485,8 +1478,8 @@
         <w:pStyle w:val="Heading2"/>
         <w:contextualSpacing w:val="0"/>
       </w:pPr>
-      <w:bookmarkStart w:id="8" w:name="h.gwwjhcsrmucd" w:colFirst="0" w:colLast="0"/>
-      <w:bookmarkEnd w:id="8"/>
+      <w:bookmarkStart w:id="10" w:name="h.gwwjhcsrmucd" w:colFirst="0" w:colLast="0"/>
+      <w:bookmarkEnd w:id="10"/>
       <w:r>
         <w:t>Importing samples</w:t>
       </w:r>
@@ -1695,15 +1688,7 @@
         <w:t xml:space="preserve">intended to </w:t>
       </w:r>
       <w:r>
-        <w:t xml:space="preserve">import samples generated and stored by the </w:t>
-      </w:r>
-      <w:proofErr w:type="spellStart"/>
-      <w:r>
-        <w:t>Cefas</w:t>
-      </w:r>
-      <w:proofErr w:type="spellEnd"/>
-      <w:r>
-        <w:t xml:space="preserve"> MSE routines.</w:t>
+        <w:t>import samples generated and stored by the Cefas MSE routines.</w:t>
       </w:r>
       <w:r>
         <w:t xml:space="preserve"> </w:t>
@@ -1717,10 +1702,16 @@
         <w:pStyle w:val="Heading2"/>
         <w:contextualSpacing w:val="0"/>
       </w:pPr>
-      <w:bookmarkStart w:id="9" w:name="h.udizqrqbvwlm" w:colFirst="0" w:colLast="0"/>
-      <w:bookmarkEnd w:id="9"/>
-      <w:r>
-        <w:t>Sample validity</w:t>
+      <w:bookmarkStart w:id="11" w:name="h.udizqrqbvwlm" w:colFirst="0" w:colLast="0"/>
+      <w:bookmarkEnd w:id="11"/>
+      <w:r>
+        <w:t>Validating</w:t>
+      </w:r>
+      <w:r>
+        <w:t xml:space="preserve"> </w:t>
+      </w:r>
+      <w:r>
+        <w:t>samples</w:t>
       </w:r>
     </w:p>
     <w:p>
@@ -1766,8 +1757,8 @@
         <w:pStyle w:val="Heading2"/>
         <w:contextualSpacing w:val="0"/>
       </w:pPr>
-      <w:bookmarkStart w:id="10" w:name="h.nykknr4r7clg" w:colFirst="0" w:colLast="0"/>
-      <w:bookmarkEnd w:id="10"/>
+      <w:bookmarkStart w:id="12" w:name="h.nykknr4r7clg" w:colFirst="0" w:colLast="0"/>
+      <w:bookmarkEnd w:id="12"/>
       <w:r>
         <w:lastRenderedPageBreak/>
         <w:t>Running samples</w:t>
@@ -1851,7 +1842,13 @@
       </w:r>
       <w:proofErr w:type="spellEnd"/>
       <w:r>
-        <w:t xml:space="preserve"> balanced, then </w:t>
+        <w:t xml:space="preserve"> </w:t>
+      </w:r>
+      <w:r>
+        <w:t>did balance</w:t>
+      </w:r>
+      <w:r>
+        <w:t xml:space="preserve">, then </w:t>
       </w:r>
       <w:proofErr w:type="spellStart"/>
       <w:r>
@@ -2000,7 +1997,7 @@
           <w:noProof/>
         </w:rPr>
         <w:drawing>
-          <wp:anchor distT="0" distB="0" distL="114300" distR="114300" simplePos="0" relativeHeight="251671552" behindDoc="0" locked="0" layoutInCell="1" allowOverlap="1">
+          <wp:anchor distT="0" distB="0" distL="114300" distR="114300" simplePos="0" relativeHeight="251671552" behindDoc="0" locked="0" layoutInCell="1" allowOverlap="1" wp14:anchorId="7D1FA7C4" wp14:editId="4274029D">
             <wp:simplePos x="0" y="0"/>
             <wp:positionH relativeFrom="column">
               <wp:posOffset>0</wp:posOffset>
@@ -2317,18 +2314,8 @@
         </w:numPr>
       </w:pPr>
       <w:r>
-        <w:t xml:space="preserve">Implement </w:t>
-      </w:r>
-      <w:proofErr w:type="spellStart"/>
-      <w:r>
-        <w:t>Cefas</w:t>
-      </w:r>
-      <w:proofErr w:type="spellEnd"/>
-      <w:r>
-        <w:t xml:space="preserve"> MSE import</w:t>
-      </w:r>
-      <w:bookmarkStart w:id="11" w:name="_GoBack"/>
-      <w:bookmarkEnd w:id="11"/>
+        <w:t>Implement Cefas MSE import</w:t>
+      </w:r>
     </w:p>
     <w:sectPr>
       <w:pgSz w:w="11909" w:h="16834"/>
@@ -3712,7 +3699,7 @@
 </file>
 
 <file path=customXml/itemProps1.xml><?xml version="1.0" encoding="utf-8"?>
-<ds:datastoreItem xmlns:ds="http://schemas.openxmlformats.org/officeDocument/2006/customXml" ds:itemID="{614027BD-A2D6-4CD5-B378-9E5DFDAFA5FC}">
+<ds:datastoreItem xmlns:ds="http://schemas.openxmlformats.org/officeDocument/2006/customXml" ds:itemID="{54ED7556-8922-47DA-B658-A95F6269EACB}">
   <ds:schemaRefs>
     <ds:schemaRef ds:uri="http://schemas.openxmlformats.org/officeDocument/2006/bibliography"/>
   </ds:schemaRefs>

</xml_diff>